<commit_message>
Improved Regression Tables, Organization
Loaded in the stargazer package and deployed it to improve regression tables. Further developed Data Analysis portion of the report outline. Also made general organization improvements to prepare for Checkpoint 2.
</commit_message>
<xml_diff>
--- a/Report Outline.docx
+++ b/Report Outline.docx
@@ -127,7 +127,7 @@
         <w:rPr>
           <w:color w:val="000000"/>
         </w:rPr>
-        <w:t>Multilinear Regression</w:t>
+        <w:t>Basic Plots</w:t>
       </w:r>
     </w:p>
     <w:p>
@@ -149,7 +149,75 @@
         <w:rPr>
           <w:color w:val="000000"/>
         </w:rPr>
-        <w:t>We will estimate a series of multi-linear regression models to test the relationship between the mortgage rate against homeownership rates by state.</w:t>
+        <w:t>We will create a series of plots that demonstrate associations between key variables both nationally and across states. These plots provide suggestive evidence of key linkages and guide the creation of the detailed regression models that follow. These plots will demonstrate mastery of the various plot types we have learned about in class.</w:t>
+      </w:r>
+    </w:p>
+    <w:p>
+      <w:pPr>
+        <w:numPr>
+          <w:ilvl w:val="0"/>
+          <w:numId w:val="2"/>
+        </w:numPr>
+        <w:pBdr>
+          <w:top w:val="nil"/>
+          <w:left w:val="nil"/>
+          <w:bottom w:val="nil"/>
+          <w:right w:val="nil"/>
+          <w:between w:val="nil"/>
+        </w:pBdr>
+        <w:spacing w:after="0"/>
+      </w:pPr>
+      <w:r>
+        <w:rPr>
+          <w:color w:val="000000"/>
+        </w:rPr>
+        <w:t>Multilinear Regression</w:t>
+      </w:r>
+    </w:p>
+    <w:p>
+      <w:pPr>
+        <w:numPr>
+          <w:ilvl w:val="1"/>
+          <w:numId w:val="2"/>
+        </w:numPr>
+        <w:pBdr>
+          <w:top w:val="nil"/>
+          <w:left w:val="nil"/>
+          <w:bottom w:val="nil"/>
+          <w:right w:val="nil"/>
+          <w:between w:val="nil"/>
+        </w:pBdr>
+        <w:spacing w:after="0"/>
+      </w:pPr>
+      <w:r>
+        <w:rPr>
+          <w:color w:val="000000"/>
+        </w:rPr>
+        <w:t xml:space="preserve">We will estimate a series of multilinear regression models to test the relationship between the mortgage rate </w:t>
+      </w:r>
+      <w:r>
+        <w:rPr>
+          <w:color w:val="000000"/>
+        </w:rPr>
+        <w:t>and</w:t>
+      </w:r>
+      <w:r>
+        <w:rPr>
+          <w:color w:val="000000"/>
+        </w:rPr>
+        <w:t xml:space="preserve"> homeownership rat</w:t>
+      </w:r>
+      <w:r>
+        <w:rPr>
+          <w:color w:val="000000"/>
+        </w:rPr>
+        <w:t>e</w:t>
+      </w:r>
+      <w:r>
+        <w:rPr>
+          <w:color w:val="000000"/>
+        </w:rPr>
+        <w:t>.</w:t>
       </w:r>
     </w:p>
     <w:p>
@@ -265,7 +333,7 @@
     <w:p>
       <w:pPr>
         <w:numPr>
-          <w:ilvl w:val="0"/>
+          <w:ilvl w:val="1"/>
           <w:numId w:val="2"/>
         </w:numPr>
         <w:pBdr>
@@ -281,7 +349,7 @@
         <w:rPr>
           <w:color w:val="000000"/>
         </w:rPr>
-        <w:t>Figure and Table Creation:</w:t>
+        <w:t>We will compare these models in a single table and explain which is our preferred model and why.</w:t>
       </w:r>
     </w:p>
     <w:p>
@@ -303,14 +371,7 @@
         <w:rPr>
           <w:color w:val="000000"/>
         </w:rPr>
-        <w:t xml:space="preserve">We will create a series of figures and tables to communicate findings to Scott Turner and his team. These figures and tables will be designed to emphasize the most important information we glean from the models, following all best practices we have learned in class. In addition to communicating our findings and confidence level, the figures will demonstrate what is at stake. For example, if we find lowering the mortgage rate by X percent increases the homeownership rate by Y percent, we will </w:t>
-      </w:r>
-      <w:r>
-        <w:rPr>
-          <w:color w:val="000000"/>
-        </w:rPr>
-        <w:lastRenderedPageBreak/>
-        <w:t xml:space="preserve">create a figure that demonstrates how many more families would own a home if the mortgage rate was lowered.  </w:t>
+        <w:t>We will interpret the models and provide discussion of our findings.</w:t>
       </w:r>
     </w:p>
     <w:p>
@@ -332,7 +393,13 @@
         <w:rPr>
           <w:color w:val="000000"/>
         </w:rPr>
-        <w:t>Robustness Checks:</w:t>
+        <w:t>Summary Figures</w:t>
+      </w:r>
+      <w:r>
+        <w:rPr>
+          <w:color w:val="000000"/>
+        </w:rPr>
+        <w:t>:</w:t>
       </w:r>
     </w:p>
     <w:p>
@@ -354,6 +421,63 @@
         <w:rPr>
           <w:color w:val="000000"/>
         </w:rPr>
+        <w:lastRenderedPageBreak/>
+        <w:t>We will create a series of figures and tables to communicate findings to Scott Turner and his team. These figures and tables will be designed to emphasize the most important information we glean from the models, following all best practices we have learned in class. In addition to communicating our findings and confidence level</w:t>
+      </w:r>
+      <w:r>
+        <w:rPr>
+          <w:color w:val="000000"/>
+        </w:rPr>
+        <w:t>s</w:t>
+      </w:r>
+      <w:r>
+        <w:rPr>
+          <w:color w:val="000000"/>
+        </w:rPr>
+        <w:t xml:space="preserve">, the figures will demonstrate what is at stake. For example, if we find lowering the mortgage rate by X percent increases the homeownership rate by Y percent, we will create a figure that demonstrates how many more families would own a home if the mortgage rate was lowered.  </w:t>
+      </w:r>
+    </w:p>
+    <w:p>
+      <w:pPr>
+        <w:numPr>
+          <w:ilvl w:val="0"/>
+          <w:numId w:val="2"/>
+        </w:numPr>
+        <w:pBdr>
+          <w:top w:val="nil"/>
+          <w:left w:val="nil"/>
+          <w:bottom w:val="nil"/>
+          <w:right w:val="nil"/>
+          <w:between w:val="nil"/>
+        </w:pBdr>
+        <w:spacing w:after="0"/>
+      </w:pPr>
+      <w:r>
+        <w:rPr>
+          <w:color w:val="000000"/>
+        </w:rPr>
+        <w:t>Robustness Checks:</w:t>
+      </w:r>
+    </w:p>
+    <w:p>
+      <w:pPr>
+        <w:numPr>
+          <w:ilvl w:val="1"/>
+          <w:numId w:val="2"/>
+        </w:numPr>
+        <w:pBdr>
+          <w:top w:val="nil"/>
+          <w:left w:val="nil"/>
+          <w:bottom w:val="nil"/>
+          <w:right w:val="nil"/>
+          <w:between w:val="nil"/>
+        </w:pBdr>
+        <w:spacing w:after="0"/>
+      </w:pPr>
+      <w:r>
+        <w:rPr>
+          <w:color w:val="000000"/>
+        </w:rPr>
         <w:t>We will perform a series of robustness checks to determine our level of confidence in our findings. We will perform the following tests on all models:</w:t>
       </w:r>
     </w:p>
@@ -573,7 +697,16 @@
           <w:color w:val="000000"/>
           <w:lang w:val="en-US"/>
         </w:rPr>
-        <w:t>. Areas with </w:t>
+        <w:t xml:space="preserve">. Areas </w:t>
+      </w:r>
+      <w:r>
+        <w:rPr>
+          <w:rFonts w:eastAsia="Times New Roman" w:cs="Times New Roman"/>
+          <w:color w:val="000000"/>
+          <w:lang w:val="en-US"/>
+        </w:rPr>
+        <w:lastRenderedPageBreak/>
+        <w:t>with </w:t>
       </w:r>
       <w:r>
         <w:rPr>
@@ -627,16 +760,7 @@
           <w:color w:val="000000"/>
           <w:lang w:val="en-US"/>
         </w:rPr>
-        <w:t xml:space="preserve"> While the homeownership rate was broadly normally distributed, there was much variation on a state-to-state basis, with homeownership rates highest (~ 70-75%) in states like West Virginia, Michigan, Delaware, Maine, and </w:t>
-      </w:r>
-      <w:r>
-        <w:rPr>
-          <w:rFonts w:eastAsia="Times New Roman" w:cs="Times New Roman"/>
-          <w:color w:val="000000"/>
-          <w:lang w:val="en-US"/>
-        </w:rPr>
-        <w:lastRenderedPageBreak/>
-        <w:t>Minnesota and lowest (~ 55-60%) in states like California, New York, Nevada, and Hawaii. </w:t>
+        <w:t> While the homeownership rate was broadly normally distributed, there was much variation on a state-to-state basis, with homeownership rates highest (~ 70-75%) in states like West Virginia, Michigan, Delaware, Maine, and Minnesota and lowest (~ 55-60%) in states like California, New York, Nevada, and Hawaii. </w:t>
       </w:r>
     </w:p>
     <w:p>
@@ -759,7 +883,16 @@
           <w:color w:val="000000"/>
           <w:lang w:val="en-US"/>
         </w:rPr>
-        <w:t> housing, as homeownership rates are lower in largely populated areas where the rent burden is already high. In addition to increasing the homeownership rate, increasing access to affordable housing also has a wealth of other benefits for people. There have been several initiatives at the state level that can be applied at the federal level to improve homeownership generally, as well as to help states that are at a lower rate potentially catch up. Actions like lessening parking requirements, density limits, and minimum lot sizes for new residential buildings allow for more financially feasible constructions. Thus, finding ways to reduce these kinds of restrictive zoning, which are otherwise contributing to the affordability crisis in the US, may further aid this endeavor to increase homeownership rates. </w:t>
+        <w:t xml:space="preserve"> housing, as homeownership rates are lower in largely populated areas where the rent burden is already high. In addition to increasing the homeownership rate, increasing access to affordable housing also has a wealth of other benefits for people. There have been several initiatives at the state level that can be applied at the federal level to improve </w:t>
+      </w:r>
+      <w:r>
+        <w:rPr>
+          <w:rFonts w:eastAsia="Times New Roman" w:cs="Times New Roman"/>
+          <w:color w:val="000000"/>
+          <w:lang w:val="en-US"/>
+        </w:rPr>
+        <w:lastRenderedPageBreak/>
+        <w:t>homeownership generally, as well as to help states that are at a lower rate potentially catch up. Actions like lessening parking requirements, density limits, and minimum lot sizes for new residential buildings allow for more financially feasible constructions. Thus, finding ways to reduce these kinds of restrictive zoning, which are otherwise contributing to the affordability crisis in the US, may further aid this endeavor to increase homeownership rates. </w:t>
       </w:r>
     </w:p>
     <w:p>
@@ -782,16 +915,7 @@
           <w:color w:val="000000"/>
           <w:lang w:val="en-US"/>
         </w:rPr>
-        <w:t xml:space="preserve">With high rent burden correlated with low homeownership, actions should be taken to also address this renter issue to allow for mobility toward homeownership for </w:t>
-      </w:r>
-      <w:r>
-        <w:rPr>
-          <w:rFonts w:eastAsia="Times New Roman" w:cs="Times New Roman"/>
-          <w:color w:val="000000"/>
-          <w:lang w:val="en-US"/>
-        </w:rPr>
-        <w:lastRenderedPageBreak/>
-        <w:t>those who want to purchase a house but have historically financially struggled to do so because of the already large burden of rent. This could be approached by the development of more affordable rental properties and/or expanding rental assistance.  We also need to turn to the impact mortgage rates have, with a one percentage point increase resulting in both an immediate and long-term negative effect on homeownership. With mortgage rates rising and staying high in recent years, it may be helpful to expand access to and opportunity for fixed-rate mortgages at lower rates. Combined, further resources and energy need to be directed toward the HOME Investment Partnerships Program, both at the rental (renter and rental construction development) and homeownership levels.</w:t>
+        <w:t>With high rent burden correlated with low homeownership, actions should be taken to also address this renter issue to allow for mobility toward homeownership for those who want to purchase a house but have historically financially struggled to do so because of the already large burden of rent. This could be approached by the development of more affordable rental properties and/or expanding rental assistance.  We also need to turn to the impact mortgage rates have, with a one percentage point increase resulting in both an immediate and long-term negative effect on homeownership. With mortgage rates rising and staying high in recent years, it may be helpful to expand access to and opportunity for fixed-rate mortgages at lower rates. Combined, further resources and energy need to be directed toward the HOME Investment Partnerships Program, both at the rental (renter and rental construction development) and homeownership levels.</w:t>
       </w:r>
     </w:p>
     <w:p>

</xml_diff>